<commit_message>
Record Paavo Rasilo's decline and draft the reply
He declined on time and suggested Anouar Belahcen and Floran Martin. The
reply accepts without pressing, corrects the fit once — he read the
chapter as machine design when it is loss separation, material
characterisation and model identification — and asks whether we may use
his name in approaching Floran.

Chapter_Ownership.md argues for giving Chapter 9 to Belahcen alongside
Chapter 8: his support letter already argues Chapter 9's premise rather
than Chapter 8's, having been written before Chapter 9 was assigned
elsewhere, so the move repairs a defect instead of creating one.

Chapter 9's owner is now unsettled, and both the stamped table of
contents and Juha's revision still name Rasilo in two places, so no table
of contents can go out until it is settled.

Co-Authored-By: Claude Opus 5 <noreply@anthropic.com>
Claude-Session: https://claude.ai/code/session_01YTsySEafbpGxYLQMAGUGjT
</commit_message>
<xml_diff>
--- a/chapter1/Chapter_Ownership.docx
+++ b/chapter1/Chapter_Ownership.docx
@@ -2997,6 +2997,220 @@
         <w:t>converter should sit in one chapter, not be divided between them.</w:t>
       </w:r>
     </w:p>
+    <w:p>
+      <w:pPr>
+        <w:pStyle w:val="Heading2"/>
+      </w:pPr>
+      <w:r>
+        <w:t>Chapter 9 after Paavo Rasilo's decline (20 September 2026)</w:t>
+      </w:r>
+    </w:p>
+    <w:p>
+      <w:pPr>
+        <w:jc w:val="both"/>
+      </w:pPr>
+      <w:r>
+        <w:t>He declined on time — the CoE and an ERC project — and added that he sees himself as a</w:t>
+      </w:r>
+    </w:p>
+    <w:p>
+      <w:pPr>
+        <w:jc w:val="both"/>
+      </w:pPr>
+      <w:r>
+        <w:t>generalist and a modeller rather than a designer, doubting he had enough to say about</w:t>
+      </w:r>
+    </w:p>
+    <w:p>
+      <w:pPr>
+        <w:jc w:val="both"/>
+      </w:pPr>
+      <w:r>
+        <w:t>machine design or the manufacturing effects on losses. He suggested Anouar Belahcen and</w:t>
+      </w:r>
+    </w:p>
+    <w:p>
+      <w:pPr>
+        <w:jc w:val="both"/>
+      </w:pPr>
+      <w:r>
+        <w:t>Floran (presumably Floran Martin, Aalto).</w:t>
+      </w:r>
+    </w:p>
+    <w:p>
+      <w:pPr>
+        <w:jc w:val="both"/>
+      </w:pPr>
+      <w:r>
+        <w:t>**Recommendation: offer Chapter 9 to Anouar Belahcen as well as Chapter 8, and let him</w:t>
+      </w:r>
+    </w:p>
+    <w:p>
+      <w:pPr>
+        <w:jc w:val="both"/>
+      </w:pPr>
+      <w:r>
+        <w:t>bring Floran Martin as co-author.** Three reasons.</w:t>
+      </w:r>
+    </w:p>
+    <w:p>
+      <w:pPr>
+        <w:jc w:val="both"/>
+      </w:pPr>
+      <w:r>
+        <w:t>1. It repairs a defect that already exists. Belahcen's support letter argues that</w:t>
+      </w:r>
+    </w:p>
+    <w:p>
+      <w:pPr>
+        <w:jc w:val="both"/>
+      </w:pPr>
+      <w:r>
+        <w:t>mains-frequency loss models do not extrapolate, that loss separation loses meaning as</w:t>
+      </w:r>
+    </w:p>
+    <w:p>
+      <w:pPr>
+        <w:jc w:val="both"/>
+      </w:pPr>
+      <w:r>
+        <w:t>frequency rises, and that the degradation from cutting, punching and stacking is itself</w:t>
+      </w:r>
+    </w:p>
+    <w:p>
+      <w:pPr>
+        <w:jc w:val="both"/>
+      </w:pPr>
+      <w:r>
+        <w:t>frequency dependent. That is Chapter 9's premise, not Chapter 8's — his letter was</w:t>
+      </w:r>
+    </w:p>
+    <w:p>
+      <w:pPr>
+        <w:jc w:val="both"/>
+      </w:pPr>
+      <w:r>
+        <w:t>written before Chapter 9 was given away. Give him Chapter 9 and the letter becomes</w:t>
+      </w:r>
+    </w:p>
+    <w:p>
+      <w:pPr>
+        <w:jc w:val="both"/>
+      </w:pPr>
+      <w:r>
+        <w:t>correct as it stands; leave things as they are and it has to be rewritten around skin</w:t>
+      </w:r>
+    </w:p>
+    <w:p>
+      <w:pPr>
+        <w:jc w:val="both"/>
+      </w:pPr>
+      <w:r>
+        <w:t>effect, transposition, litz and hairpin conductors.</w:t>
+      </w:r>
+    </w:p>
+    <w:p>
+      <w:pPr>
+        <w:jc w:val="both"/>
+      </w:pPr>
+      <w:r>
+        <w:t>2. Chapters 8 and 9 are the two loss chapters and each cites the other's budget. One owner</w:t>
+      </w:r>
+    </w:p>
+    <w:p>
+      <w:pPr>
+        <w:jc w:val="both"/>
+      </w:pPr>
+      <w:r>
+        <w:t>removes a seam that would otherwise need reconciling by us.</w:t>
+      </w:r>
+    </w:p>
+    <w:p>
+      <w:pPr>
+        <w:jc w:val="both"/>
+      </w:pPr>
+      <w:r>
+        <w:t>3. Floran Martin works on magnetic materials and loss modelling in that orbit, so the</w:t>
+      </w:r>
+    </w:p>
+    <w:p>
+      <w:pPr>
+        <w:jc w:val="both"/>
+      </w:pPr>
+      <w:r>
+        <w:t>co-author Paavo named arrives through Anouar rather than through a cold approach from us.</w:t>
+      </w:r>
+    </w:p>
+    <w:p>
+      <w:pPr>
+        <w:jc w:val="both"/>
+      </w:pPr>
+      <w:r>
+        <w:t>The cost is 58 pages under one owner. Sopanen already carries 96, so there is precedent.</w:t>
+      </w:r>
+    </w:p>
+    <w:p>
+      <w:pPr>
+        <w:jc w:val="both"/>
+      </w:pPr>
+      <w:r>
+        <w:t>The alternative is to approach Floran Martin directly as owner, with Paavo's name as the</w:t>
+      </w:r>
+    </w:p>
+    <w:p>
+      <w:pPr>
+        <w:jc w:val="both"/>
+      </w:pPr>
+      <w:r>
+        <w:t>introduction. That spreads the load and puts a new name on the proposal, which reviewers</w:t>
+      </w:r>
+    </w:p>
+    <w:p>
+      <w:pPr>
+        <w:jc w:val="both"/>
+      </w:pPr>
+      <w:r>
+        <w:t>like, but it leaves Belahcen's letter needing a rewrite and adds a cold contact at a late</w:t>
+      </w:r>
+    </w:p>
+    <w:p>
+      <w:pPr>
+        <w:jc w:val="both"/>
+      </w:pPr>
+      <w:r>
+        <w:t>stage.</w:t>
+      </w:r>
+    </w:p>
+    <w:p>
+      <w:pPr>
+        <w:jc w:val="both"/>
+      </w:pPr>
+      <w:r>
+        <w:rPr>
+          <w:b/>
+        </w:rPr>
+        <w:t>Until this is settled, no table of contents may be sent to anyone</w:t>
+      </w:r>
+      <w:r>
+        <w:t>: both</w:t>
+      </w:r>
+    </w:p>
+    <w:p>
+      <w:pPr>
+        <w:jc w:val="both"/>
+      </w:pPr>
+      <w:r>
+        <w:t>`to_send/Annotated_Table_of_Contents.docx` and Juha's revision name Paavo Rasilo in the</w:t>
+      </w:r>
+    </w:p>
+    <w:p>
+      <w:pPr>
+        <w:jc w:val="both"/>
+      </w:pPr>
+      <w:r>
+        <w:t>ownership table and again in the Chapter 9 budget line.</w:t>
+      </w:r>
+    </w:p>
     <w:sectPr>
       <w:pgSz w:w="12240" w:h="15840"/>
       <w:pgMar w:top="1440" w:right="1800" w:bottom="1440" w:left="1800" w:header="720" w:footer="720" w:gutter="0"/>

</xml_diff>

<commit_message>
File Anouar Belahcen's letter; record Chapter 9 as the open decision
His letter is signed and dated 3 September, on Aalto letterhead. It
keeps the chapter sentence of our draft word for word: "the loss
chapters of the book, on AC winding losses and conductor design and on
the core, rotor and aerodynamic losses". He signed it four days before
the restructure gave Chapter 9 to Paavo Rasilo, and Chapter 9 has not
been discussed with him since.

The earlier notes treated the letter as settling Chapter 9. It does
not. Who replaces Paavo is for the editors to decide on 7 October. The
brief and Chapter_Ownership.md now set out three options: Anouar takes
both loss chapters, Floran Martin owns Chapter 9, or the editors take
it. Each option records what it means for his letter, and that he
should hear the outcome from us before the table of contents is
fixed.

Co-Authored-By: Claude Opus 5.5 <noreply@anthropic.com>
Claude-Session: https://claude.ai/code/session_01YTsySEafbpGxYLQMAGUGjT
</commit_message>
<xml_diff>
--- a/chapter1/Chapter_Ownership.docx
+++ b/chapter1/Chapter_Ownership.docx
@@ -3472,6 +3472,136 @@
         <w:t>turbo-expanders as well as to compressors.</w:t>
       </w:r>
     </w:p>
+    <w:p>
+      <w:pPr>
+        <w:pStyle w:val="Heading2"/>
+      </w:pPr>
+      <w:r>
+        <w:t>Chapter 9 is open, and Anouar's letter names it (7 October 2026)</w:t>
+      </w:r>
+    </w:p>
+    <w:p>
+      <w:pPr>
+        <w:jc w:val="both"/>
+      </w:pPr>
+      <w:r>
+        <w:t>Anouar Belahcen's signed letter is dated 3 September, four days before the fourteen-chapter</w:t>
+      </w:r>
+    </w:p>
+    <w:p>
+      <w:pPr>
+        <w:jc w:val="both"/>
+      </w:pPr>
+      <w:r>
+        <w:t>restructure gave Chapter 9 to Paavo Rasilo. It keeps our draft's chapter sentence word for</w:t>
+      </w:r>
+    </w:p>
+    <w:p>
+      <w:pPr>
+        <w:jc w:val="both"/>
+      </w:pPr>
+      <w:r>
+        <w:t>word: "the loss chapters of the book, on AC winding losses and conductor design and on the</w:t>
+      </w:r>
+    </w:p>
+    <w:p>
+      <w:pPr>
+        <w:jc w:val="both"/>
+      </w:pPr>
+      <w:r>
+        <w:t>core, rotor and aerodynamic losses". That matched the invitation, which offered him "one or two</w:t>
+      </w:r>
+    </w:p>
+    <w:p>
+      <w:pPr>
+        <w:jc w:val="both"/>
+      </w:pPr>
+      <w:r>
+        <w:t>chapters" on the losses.</w:t>
+      </w:r>
+    </w:p>
+    <w:p>
+      <w:pPr>
+        <w:jc w:val="both"/>
+      </w:pPr>
+      <w:r>
+        <w:t>Chapter 9 has never been discussed with him: not its move to Paavo, and not, since Paavo's</w:t>
+      </w:r>
+    </w:p>
+    <w:p>
+      <w:pPr>
+        <w:jc w:val="both"/>
+      </w:pPr>
+      <w:r>
+        <w:t>decline, who replaces him. That is for the editors to decide on 7 October, among three options:</w:t>
+      </w:r>
+    </w:p>
+    <w:p>
+      <w:pPr>
+        <w:pStyle w:val="ListBullet"/>
+      </w:pPr>
+      <w:r>
+        <w:rPr>
+          <w:b/>
+        </w:rPr>
+        <w:t>A.</w:t>
+      </w:r>
+      <w:r>
+        <w:t xml:space="preserve"> Anouar takes Chapter 9 as well as Chapter 8, with Floran Martin as his co-author if he wants one.</w:t>
+      </w:r>
+    </w:p>
+    <w:p>
+      <w:pPr>
+        <w:pStyle w:val="ListBullet"/>
+      </w:pPr>
+      <w:r>
+        <w:rPr>
+          <w:b/>
+        </w:rPr>
+        <w:t>B.</w:t>
+      </w:r>
+      <w:r>
+        <w:t xml:space="preserve"> Floran Martin owns Chapter 9, introduced with Paavo's name.</w:t>
+      </w:r>
+    </w:p>
+    <w:p>
+      <w:pPr>
+        <w:pStyle w:val="ListBullet"/>
+      </w:pPr>
+      <w:r>
+        <w:rPr>
+          <w:b/>
+        </w:rPr>
+        <w:t>C.</w:t>
+      </w:r>
+      <w:r>
+        <w:t xml:space="preserve"> The editors take Chapter 9, with Ilya on the rotor losses.</w:t>
+      </w:r>
+    </w:p>
+    <w:p>
+      <w:pPr>
+        <w:jc w:val="both"/>
+      </w:pPr>
+      <w:r>
+        <w:t>The letter stands as written under A, or under B or C if Anouar still writes part of Chapter 9.</w:t>
+      </w:r>
+    </w:p>
+    <w:p>
+      <w:pPr>
+        <w:jc w:val="both"/>
+      </w:pPr>
+      <w:r>
+        <w:t>Otherwise its chapter sentence must change. Whichever is chosen, he should hear it from us</w:t>
+      </w:r>
+    </w:p>
+    <w:p>
+      <w:pPr>
+        <w:jc w:val="both"/>
+      </w:pPr>
+      <w:r>
+        <w:t>before the table of contents is fixed.</w:t>
+      </w:r>
+    </w:p>
     <w:sectPr>
       <w:pgSz w:w="12240" w:h="15840"/>
       <w:pgMar w:top="1440" w:right="1800" w:bottom="1440" w:left="1800" w:header="720" w:footer="720" w:gutter="0"/>

</xml_diff>